<commit_message>
Docs: suppression des doublons et ajout effect wow
</commit_message>
<xml_diff>
--- a/Cahier des charges.docx
+++ b/Cahier des charges.docx
@@ -485,7 +485,13 @@
     <w:sdt>
       <w:sdtPr>
         <w:rPr>
-          <w:lang w:val="fr-FR"/>
+          <w:rFonts w:asciiTheme="minorHAnsi" w:eastAsiaTheme="minorHAnsi" w:hAnsiTheme="minorHAnsi" w:cstheme="minorBidi"/>
+          <w:color w:val="auto"/>
+          <w:kern w:val="2"/>
+          <w:sz w:val="24"/>
+          <w:szCs w:val="24"/>
+          <w:lang w:val="fr-FR" w:eastAsia="en-US"/>
+          <w14:ligatures w14:val="standardContextual"/>
         </w:rPr>
         <w:id w:val="-1468282945"/>
         <w:docPartObj>
@@ -495,15 +501,8 @@
       </w:sdtPr>
       <w:sdtEndPr>
         <w:rPr>
-          <w:rFonts w:asciiTheme="minorHAnsi" w:eastAsiaTheme="minorHAnsi" w:hAnsiTheme="minorHAnsi" w:cstheme="minorBidi"/>
           <w:b/>
           <w:bCs/>
-          <w:color w:val="auto"/>
-          <w:kern w:val="2"/>
-          <w:sz w:val="24"/>
-          <w:szCs w:val="24"/>
-          <w:lang w:eastAsia="en-US"/>
-          <w14:ligatures w14:val="standardContextual"/>
         </w:rPr>
       </w:sdtEndPr>
       <w:sdtContent>
@@ -1337,110 +1336,136 @@
       <w:pPr>
         <w:pStyle w:val="Titre1"/>
       </w:pPr>
-      <w:bookmarkStart w:id="0" w:name="_Toc223020859"/>
+      <w:r>
+        <w:lastRenderedPageBreak/>
+        <w:t>Contexte</w:t>
+      </w:r>
+      <w:r>
+        <w:t xml:space="preserve"> </w:t>
+      </w:r>
+    </w:p>
+    <w:p/>
+    <w:p>
+      <w:r>
+        <w:t xml:space="preserve">Afin de finaliser mon </w:t>
+      </w:r>
       <w:proofErr w:type="spellStart"/>
       <w:r>
+        <w:t>bachelor</w:t>
+      </w:r>
+      <w:proofErr w:type="spellEnd"/>
+      <w:r>
+        <w:t xml:space="preserve"> à l'HEIG-VD, j'ai l'occasion de réaliser un travail de </w:t>
+      </w:r>
+      <w:proofErr w:type="spellStart"/>
+      <w:r>
+        <w:t>bachelor</w:t>
+      </w:r>
+      <w:proofErr w:type="spellEnd"/>
+      <w:r>
+        <w:t>. J'utilise donc cette opportunité pour proposer un projet conséquent dans le domaine vers lequel j'aimerais me tourner après mes études.</w:t>
+      </w:r>
+    </w:p>
+    <w:p>
+      <w:pPr>
+        <w:pStyle w:val="Titre1"/>
+      </w:pPr>
+      <w:bookmarkStart w:id="0" w:name="_Toc223020860"/>
+      <w:r>
+        <w:t>Description du projet</w:t>
+      </w:r>
+      <w:bookmarkEnd w:id="0"/>
+    </w:p>
+    <w:p/>
+    <w:p>
+      <w:r>
+        <w:t xml:space="preserve">Le projet a pour but de créer un jeu ayant un style similaire à des gros jeux déjà existants mais en y ajoutant un twist pour le rendre un peu unique. L'objectif n'est en aucun cas de créer quelque chose de révolutionnaire, mais de créer un jeu entier qui serait du même gabarit que des géants du secteur et avec lequel les joueurs s'amuseront. On cherche donc à réaliser un jeu jouable en ligne multijoueur </w:t>
+      </w:r>
+      <w:proofErr w:type="spellStart"/>
+      <w:r>
+        <w:t>autobattler</w:t>
+      </w:r>
+      <w:proofErr w:type="spellEnd"/>
+      <w:r>
+        <w:t>, où 8 personnes pourront s'affronter dans la même partie.</w:t>
+      </w:r>
+    </w:p>
+    <w:p/>
+    <w:p>
+      <w:pPr>
+        <w:pStyle w:val="Titre1"/>
+      </w:pPr>
+      <w:bookmarkStart w:id="1" w:name="_Toc223020861"/>
+      <w:proofErr w:type="gramStart"/>
+      <w:r>
+        <w:t>Technologie utilisés</w:t>
+      </w:r>
+      <w:bookmarkEnd w:id="1"/>
+      <w:proofErr w:type="gramEnd"/>
+    </w:p>
+    <w:p/>
+    <w:p>
+      <w:r>
+        <w:t xml:space="preserve">Pour ce projet je vais utiliser le </w:t>
+      </w:r>
+      <w:r>
+        <w:t>Framework</w:t>
+      </w:r>
+      <w:r>
+        <w:t xml:space="preserve"> Play pour le développer, il aura donc pour objectif d'être jouable sur navigateur internet. Pour le stockage des données je vais utiliser la base de données PostgreSQL.</w:t>
+      </w:r>
+    </w:p>
+    <w:p/>
+    <w:p>
+      <w:pPr>
+        <w:pStyle w:val="Titre1"/>
+      </w:pPr>
+      <w:r>
+        <w:t>Valeur d’ingénierie du projet</w:t>
+      </w:r>
+    </w:p>
+    <w:p>
+      <w:r>
+        <w:t>Tout l’intérêt du projet réside dans la réalisation d’un jeu multijoueur entièrement en ligne, accessible directement depuis un navigateur web et ne nécessitant aucune installation côté utilisateur.</w:t>
+      </w:r>
+    </w:p>
+    <w:p>
+      <w:r>
+        <w:t>Le système repose sur une architecture client-serveur complète combinant une interface interactive, un serveur applicatif et une base de données persistante. Contrairement à une application web classique, le projet implique des communications bidirectionnelles en temps réel afin de permettre l’interaction simultanée de plusieurs joueurs au sein d’une même partie.</w:t>
+      </w:r>
+    </w:p>
+    <w:p>
+      <w:r>
+        <w:t xml:space="preserve">L’aspect multijoueur introduit des défis techniques importants, notamment la synchronisation d’état entre plusieurs clients, la gestion de la latence réseau, la </w:t>
+      </w:r>
+      <w:r>
         <w:lastRenderedPageBreak/>
-        <w:t>Context</w:t>
-      </w:r>
-      <w:bookmarkEnd w:id="0"/>
-      <w:proofErr w:type="spellEnd"/>
-      <w:r>
-        <w:t xml:space="preserve"> </w:t>
-      </w:r>
-    </w:p>
-    <w:p/>
-    <w:p>
-      <w:r>
-        <w:t xml:space="preserve">Afin de finaliser mon </w:t>
-      </w:r>
-      <w:proofErr w:type="spellStart"/>
-      <w:r>
-        <w:t>bachelor</w:t>
-      </w:r>
-      <w:proofErr w:type="spellEnd"/>
-      <w:r>
-        <w:t xml:space="preserve"> à l'HEIG-VD, j'ai l'occasion de réaliser un travail de </w:t>
-      </w:r>
-      <w:proofErr w:type="spellStart"/>
-      <w:r>
-        <w:t>bachelor</w:t>
-      </w:r>
-      <w:proofErr w:type="spellEnd"/>
-      <w:r>
-        <w:t>. J'utilise donc cette opportunité pour proposer un projet conséquent dans le domaine vers lequel j'aimerais me tourner après mes études.</w:t>
+        <w:t>cohérence des actions concurrentes et la fiabilité des communications. Le serveur doit également orchestrer plusieurs parties simultanées tout en garantissant l’intégrité des données et la continuité de l’expérience de jeu.</w:t>
+      </w:r>
+    </w:p>
+    <w:p>
+      <w:r>
+        <w:t xml:space="preserve">Le projet vise à démontrer qu’un système multijoueur en ligne typiquement réservé à des </w:t>
+      </w:r>
+      <w:r>
+        <w:t xml:space="preserve">studio AAA </w:t>
+      </w:r>
+      <w:r>
+        <w:t>peut être conçu et implémenté dans un cadre académique individuel.</w:t>
       </w:r>
     </w:p>
     <w:p>
       <w:pPr>
         <w:pStyle w:val="Titre1"/>
       </w:pPr>
-      <w:bookmarkStart w:id="1" w:name="_Toc223020860"/>
-      <w:r>
-        <w:t>Description du projet</w:t>
-      </w:r>
-      <w:bookmarkEnd w:id="1"/>
-    </w:p>
-    <w:p/>
-    <w:p>
-      <w:r>
-        <w:t xml:space="preserve">Le projet a pour but de créer un jeu ayant un style similaire à des gros jeux déjà existants mais en y ajoutant un twist pour le rendre un peu unique. L'objectif n'est en aucun cas de créer quelque chose de révolutionnaire, mais de créer un jeu entier qui serait du même gabarit que des géants du secteur et avec lequel les joueurs s'amuseront. On cherche donc à réaliser un jeu jouable en ligne multijoueur </w:t>
-      </w:r>
-      <w:proofErr w:type="spellStart"/>
-      <w:r>
-        <w:t>autobattler</w:t>
-      </w:r>
-      <w:proofErr w:type="spellEnd"/>
-      <w:r>
-        <w:t>, où 8 personnes pourront s'affronter dans la même partie.</w:t>
-      </w:r>
-    </w:p>
-    <w:p/>
-    <w:p>
-      <w:pPr>
-        <w:pStyle w:val="Titre1"/>
-      </w:pPr>
-      <w:bookmarkStart w:id="2" w:name="_Toc223020861"/>
-      <w:proofErr w:type="gramStart"/>
-      <w:r>
-        <w:t>Technologie utilisés</w:t>
+      <w:bookmarkStart w:id="2" w:name="_Toc223020862"/>
+      <w:r>
+        <w:t>F</w:t>
+      </w:r>
+      <w:r>
+        <w:t>onctionnalités attendues</w:t>
       </w:r>
       <w:bookmarkEnd w:id="2"/>
-      <w:proofErr w:type="gramEnd"/>
-    </w:p>
-    <w:p/>
-    <w:p>
-      <w:r>
-        <w:t xml:space="preserve">Pour ce projet je vais utiliser le </w:t>
-      </w:r>
-      <w:proofErr w:type="spellStart"/>
-      <w:r>
-        <w:t>framework</w:t>
-      </w:r>
-      <w:proofErr w:type="spellEnd"/>
-      <w:r>
-        <w:t xml:space="preserve"> Play pour le développer, il aura donc pour objectif d'être jouable sur navigateur internet. Pour le stockage des données je vais utiliser la base de données PostgreSQL.</w:t>
-      </w:r>
-    </w:p>
-    <w:p/>
-    <w:p/>
-    <w:p/>
-    <w:p/>
-    <w:p/>
-    <w:p/>
-    <w:p>
-      <w:pPr>
-        <w:pStyle w:val="Titre1"/>
-      </w:pPr>
-      <w:bookmarkStart w:id="3" w:name="_Toc223020862"/>
-      <w:r>
-        <w:lastRenderedPageBreak/>
-        <w:t>F</w:t>
-      </w:r>
-      <w:r>
-        <w:t>onctionnalités attendues</w:t>
-      </w:r>
-      <w:bookmarkEnd w:id="3"/>
     </w:p>
     <w:p>
       <w:pPr>
@@ -1452,7 +1477,7 @@
           <w:szCs w:val="24"/>
         </w:rPr>
       </w:pPr>
-      <w:bookmarkStart w:id="4" w:name="_Toc223020863"/>
+      <w:bookmarkStart w:id="3" w:name="_Toc223020863"/>
       <w:r>
         <w:rPr>
           <w:rFonts w:asciiTheme="minorHAnsi" w:eastAsiaTheme="minorHAnsi" w:hAnsiTheme="minorHAnsi" w:cstheme="minorBidi"/>
@@ -1470,7 +1495,7 @@
       <w:r>
         <w:t>Must have</w:t>
       </w:r>
-      <w:bookmarkEnd w:id="4"/>
+      <w:bookmarkEnd w:id="3"/>
     </w:p>
     <w:p>
       <w:pPr>
@@ -1488,13 +1513,7 @@
         <w:rPr>
           <w:rFonts w:asciiTheme="minorHAnsi" w:hAnsiTheme="minorHAnsi"/>
         </w:rPr>
-        <w:t>U</w:t>
-      </w:r>
-      <w:r>
-        <w:rPr>
-          <w:rFonts w:asciiTheme="minorHAnsi" w:hAnsiTheme="minorHAnsi"/>
-        </w:rPr>
-        <w:t>n système de login, où chaque utilisateur pourra se connecter et regarder ses statistiques, soit le nombre de victoires dans un premier temps</w:t>
+        <w:t>Un système de login, où chaque utilisateur pourra se connecter et regarder ses statistiques, soit le nombre de victoires dans un premier temps</w:t>
       </w:r>
     </w:p>
     <w:p>
@@ -1513,13 +1532,7 @@
         <w:rPr>
           <w:rFonts w:asciiTheme="minorHAnsi" w:hAnsiTheme="minorHAnsi"/>
         </w:rPr>
-        <w:t>U</w:t>
-      </w:r>
-      <w:r>
-        <w:rPr>
-          <w:rFonts w:asciiTheme="minorHAnsi" w:hAnsiTheme="minorHAnsi"/>
-        </w:rPr>
-        <w:t>n système de connexion multijoueur, où l'on pourra connecter 8 personnes à la même partie afin qu'ils s'affrontent</w:t>
+        <w:t>Un système de connexion multijoueur, où l'on pourra connecter 8 personnes à la même partie afin qu'ils s'affrontent</w:t>
       </w:r>
     </w:p>
     <w:p>
@@ -1538,13 +1551,7 @@
         <w:rPr>
           <w:rFonts w:asciiTheme="minorHAnsi" w:hAnsiTheme="minorHAnsi"/>
         </w:rPr>
-        <w:t>U</w:t>
-      </w:r>
-      <w:r>
-        <w:rPr>
-          <w:rFonts w:asciiTheme="minorHAnsi" w:hAnsiTheme="minorHAnsi"/>
-        </w:rPr>
-        <w:t>n système de stockage des données utilisateurs</w:t>
+        <w:t>Un système de stockage des données utilisateurs</w:t>
       </w:r>
     </w:p>
     <w:p>
@@ -1563,20 +1570,20 @@
         <w:rPr>
           <w:rFonts w:asciiTheme="minorHAnsi" w:hAnsiTheme="minorHAnsi"/>
         </w:rPr>
-        <w:t>U</w:t>
+        <w:t>Un système de partie opérationnel : donc où un joueur pourrait lancer une partie pour jouer contre d'autres joueurs ou des bots. Donc cela inclut</w:t>
       </w:r>
       <w:r>
         <w:rPr>
           <w:rFonts w:asciiTheme="minorHAnsi" w:hAnsiTheme="minorHAnsi"/>
         </w:rPr>
-        <w:t>n système de partie opérationnel : donc où un joueur pourrait lancer une partie pour jouer contre d'autres joueurs ou des bots. Donc cela inclut</w:t>
+        <w:t> :</w:t>
       </w:r>
     </w:p>
     <w:p>
       <w:pPr>
         <w:pStyle w:val="NormalWeb"/>
         <w:numPr>
-          <w:ilvl w:val="0"/>
+          <w:ilvl w:val="1"/>
           <w:numId w:val="10"/>
         </w:numPr>
         <w:spacing w:line="276" w:lineRule="auto"/>
@@ -1588,20 +1595,14 @@
         <w:rPr>
           <w:rFonts w:asciiTheme="minorHAnsi" w:hAnsiTheme="minorHAnsi"/>
         </w:rPr>
-        <w:t>U</w:t>
-      </w:r>
-      <w:r>
-        <w:rPr>
-          <w:rFonts w:asciiTheme="minorHAnsi" w:hAnsiTheme="minorHAnsi"/>
-        </w:rPr>
-        <w:t>n système de boutique pour acheter les unités</w:t>
+        <w:t>Un système de boutique pour acheter les unités</w:t>
       </w:r>
     </w:p>
     <w:p>
       <w:pPr>
         <w:pStyle w:val="NormalWeb"/>
         <w:numPr>
-          <w:ilvl w:val="0"/>
+          <w:ilvl w:val="1"/>
           <w:numId w:val="10"/>
         </w:numPr>
         <w:spacing w:line="276" w:lineRule="auto"/>
@@ -1613,20 +1614,14 @@
         <w:rPr>
           <w:rFonts w:asciiTheme="minorHAnsi" w:hAnsiTheme="minorHAnsi"/>
         </w:rPr>
-        <w:t>U</w:t>
-      </w:r>
-      <w:r>
-        <w:rPr>
-          <w:rFonts w:asciiTheme="minorHAnsi" w:hAnsiTheme="minorHAnsi"/>
-        </w:rPr>
-        <w:t>n système de combat qui fera s'affronter les unités de deux joueurs à intervalles réguliers</w:t>
+        <w:t>Un système de combat qui fera s'affronter les unités de deux joueurs à intervalles réguliers</w:t>
       </w:r>
     </w:p>
     <w:p>
       <w:pPr>
         <w:pStyle w:val="NormalWeb"/>
         <w:numPr>
-          <w:ilvl w:val="0"/>
+          <w:ilvl w:val="1"/>
           <w:numId w:val="10"/>
         </w:numPr>
         <w:spacing w:line="276" w:lineRule="auto"/>
@@ -1638,26 +1633,14 @@
         <w:rPr>
           <w:rFonts w:asciiTheme="minorHAnsi" w:hAnsiTheme="minorHAnsi"/>
         </w:rPr>
-        <w:t>U</w:t>
-      </w:r>
-      <w:r>
-        <w:rPr>
-          <w:rFonts w:asciiTheme="minorHAnsi" w:hAnsiTheme="minorHAnsi"/>
-        </w:rPr>
-        <w:t>n système de gestion de son équipe afin que l'on puisse changer soit la formation de son équipe ou bien les unités constituant mon équipe</w:t>
-      </w:r>
-      <w:r>
-        <w:rPr>
-          <w:rFonts w:asciiTheme="minorHAnsi" w:hAnsiTheme="minorHAnsi"/>
-        </w:rPr>
-        <w:t>.</w:t>
+        <w:t>Un système de gestion de son équipe afin que l'on puisse changer soit la formation de son équipe ou bien les unités constituant mon équipe.</w:t>
       </w:r>
     </w:p>
     <w:p>
       <w:pPr>
         <w:pStyle w:val="Titre2"/>
       </w:pPr>
-      <w:bookmarkStart w:id="5" w:name="_Toc223020864"/>
+      <w:bookmarkStart w:id="4" w:name="_Toc223020864"/>
       <w:proofErr w:type="spellStart"/>
       <w:r>
         <w:t>Should</w:t>
@@ -1666,7 +1649,7 @@
       <w:r>
         <w:t xml:space="preserve"> have</w:t>
       </w:r>
-      <w:bookmarkEnd w:id="5"/>
+      <w:bookmarkEnd w:id="4"/>
     </w:p>
     <w:p>
       <w:pPr>
@@ -1683,13 +1666,7 @@
         <w:rPr>
           <w:rFonts w:asciiTheme="minorHAnsi" w:hAnsiTheme="minorHAnsi"/>
         </w:rPr>
-        <w:t>U</w:t>
-      </w:r>
-      <w:r>
-        <w:rPr>
-          <w:rFonts w:asciiTheme="minorHAnsi" w:hAnsiTheme="minorHAnsi"/>
-        </w:rPr>
-        <w:t>n système de classe et de famille pour les unités : au-delà d'avoir une unité, en avoir plusieurs différentes de la même classe ou famille devrait accorder un bonus (cf. GDD)</w:t>
+        <w:t>Un système de classe et de famille pour les unités : au-delà d'avoir une unité, en avoir plusieurs différentes de la même classe ou famille devrait accorder un bonus (cf. GDD)</w:t>
       </w:r>
     </w:p>
     <w:p>
@@ -1707,13 +1684,7 @@
         <w:rPr>
           <w:rFonts w:asciiTheme="minorHAnsi" w:hAnsiTheme="minorHAnsi"/>
         </w:rPr>
-        <w:t>U</w:t>
-      </w:r>
-      <w:r>
-        <w:rPr>
-          <w:rFonts w:asciiTheme="minorHAnsi" w:hAnsiTheme="minorHAnsi"/>
-        </w:rPr>
-        <w:t xml:space="preserve">n </w:t>
+        <w:t xml:space="preserve">Un </w:t>
       </w:r>
       <w:proofErr w:type="spellStart"/>
       <w:r>
@@ -1745,20 +1716,14 @@
         <w:rPr>
           <w:rFonts w:asciiTheme="minorHAnsi" w:hAnsiTheme="minorHAnsi"/>
         </w:rPr>
-        <w:t>U</w:t>
-      </w:r>
-      <w:r>
-        <w:rPr>
-          <w:rFonts w:asciiTheme="minorHAnsi" w:hAnsiTheme="minorHAnsi"/>
-        </w:rPr>
-        <w:t>ne interaction spécifique lors de l'utilisation de chaque famille : s'il y a suffisamment d'unités différentes d'une même famille dans votre équipe, cela devrait apporter une mécanique nouvelle lors des combats</w:t>
+        <w:t>Une interaction spécifique lors de l'utilisation de chaque famille : s'il y a suffisamment d'unités différentes d'une même famille dans votre équipe, cela devrait apporter une mécanique nouvelle lors des combats</w:t>
       </w:r>
     </w:p>
     <w:p>
       <w:pPr>
         <w:pStyle w:val="Titre2"/>
       </w:pPr>
-      <w:bookmarkStart w:id="6" w:name="_Toc223020865"/>
+      <w:bookmarkStart w:id="5" w:name="_Toc223020865"/>
       <w:proofErr w:type="spellStart"/>
       <w:r>
         <w:t>Could</w:t>
@@ -1767,7 +1732,7 @@
       <w:r>
         <w:t xml:space="preserve"> have</w:t>
       </w:r>
-      <w:bookmarkEnd w:id="6"/>
+      <w:bookmarkEnd w:id="5"/>
     </w:p>
     <w:p>
       <w:pPr>
@@ -1784,13 +1749,7 @@
         <w:rPr>
           <w:rFonts w:asciiTheme="minorHAnsi" w:hAnsiTheme="minorHAnsi"/>
         </w:rPr>
-        <w:t>U</w:t>
-      </w:r>
-      <w:r>
-        <w:rPr>
-          <w:rFonts w:asciiTheme="minorHAnsi" w:hAnsiTheme="minorHAnsi"/>
-        </w:rPr>
-        <w:t>n système d'augment pendant la partie : durant la partie plusieurs choix aléatoires sont proposés aux joueurs afin d'améliorer leur équipe ou de changer leur partie actuelle</w:t>
+        <w:t>Un système d'augment pendant la partie : durant la partie plusieurs choix aléatoires sont proposés aux joueurs afin d'améliorer leur équipe ou de changer leur partie actuelle</w:t>
       </w:r>
     </w:p>
     <w:p>
@@ -1808,13 +1767,8 @@
         <w:rPr>
           <w:rFonts w:asciiTheme="minorHAnsi" w:hAnsiTheme="minorHAnsi"/>
         </w:rPr>
-        <w:t>U</w:t>
-      </w:r>
-      <w:r>
-        <w:rPr>
-          <w:rFonts w:asciiTheme="minorHAnsi" w:hAnsiTheme="minorHAnsi"/>
-        </w:rPr>
-        <w:t>n pouvoir spécifique aux joueurs, et où chaque joueur pourrait choisir entre certains pouvoirs afin de changer la dynamique de sa partie</w:t>
+        <w:lastRenderedPageBreak/>
+        <w:t>Un pouvoir spécifique aux joueurs, et où chaque joueur pourrait choisir entre certains pouvoirs afin de changer la dynamique de sa partie</w:t>
       </w:r>
     </w:p>
     <w:p>
@@ -1832,47 +1786,40 @@
         <w:rPr>
           <w:rFonts w:asciiTheme="minorHAnsi" w:hAnsiTheme="minorHAnsi"/>
         </w:rPr>
-        <w:t>U</w:t>
-      </w:r>
+        <w:t xml:space="preserve">Une IA complexe et </w:t>
+      </w:r>
+      <w:proofErr w:type="spellStart"/>
       <w:r>
         <w:rPr>
           <w:rFonts w:asciiTheme="minorHAnsi" w:hAnsiTheme="minorHAnsi"/>
         </w:rPr>
-        <w:t xml:space="preserve">ne IA complexe et </w:t>
-      </w:r>
+        <w:t>challengeante</w:t>
+      </w:r>
+      <w:proofErr w:type="spellEnd"/>
+      <w:r>
+        <w:rPr>
+          <w:rFonts w:asciiTheme="minorHAnsi" w:hAnsiTheme="minorHAnsi"/>
+        </w:rPr>
+        <w:t>, qui pourrait poser un vrai danger à des joueurs connaissant le jeu ou les jeux de ce genre</w:t>
+      </w:r>
+    </w:p>
+    <w:p>
+      <w:pPr>
+        <w:pStyle w:val="Titre2"/>
+      </w:pPr>
+      <w:bookmarkStart w:id="6" w:name="_Toc223020866"/>
       <w:proofErr w:type="spellStart"/>
       <w:r>
-        <w:rPr>
-          <w:rFonts w:asciiTheme="minorHAnsi" w:hAnsiTheme="minorHAnsi"/>
-        </w:rPr>
-        <w:t>challengeante</w:t>
+        <w:t>W</w:t>
+      </w:r>
+      <w:r>
+        <w:t>on't</w:t>
       </w:r>
       <w:proofErr w:type="spellEnd"/>
       <w:r>
-        <w:rPr>
-          <w:rFonts w:asciiTheme="minorHAnsi" w:hAnsiTheme="minorHAnsi"/>
-        </w:rPr>
-        <w:t>, qui pourrait poser un vrai danger à des joueurs connaissant le jeu ou les jeux de ce genre</w:t>
-      </w:r>
-    </w:p>
-    <w:p>
-      <w:pPr>
-        <w:pStyle w:val="Titre2"/>
-      </w:pPr>
-      <w:bookmarkStart w:id="7" w:name="_Toc223020866"/>
-      <w:proofErr w:type="spellStart"/>
-      <w:r>
-        <w:lastRenderedPageBreak/>
-        <w:t>W</w:t>
-      </w:r>
-      <w:r>
-        <w:t>on't</w:t>
-      </w:r>
-      <w:proofErr w:type="spellEnd"/>
-      <w:r>
         <w:t xml:space="preserve"> have</w:t>
       </w:r>
-      <w:bookmarkEnd w:id="7"/>
+      <w:bookmarkEnd w:id="6"/>
     </w:p>
     <w:p>
       <w:pPr>
@@ -1889,13 +1836,7 @@
         <w:rPr>
           <w:rFonts w:asciiTheme="minorHAnsi" w:hAnsiTheme="minorHAnsi"/>
         </w:rPr>
-        <w:t>U</w:t>
-      </w:r>
-      <w:r>
-        <w:rPr>
-          <w:rFonts w:asciiTheme="minorHAnsi" w:hAnsiTheme="minorHAnsi"/>
-        </w:rPr>
-        <w:t>ne vraie direction artistique</w:t>
+        <w:t>Une vraie direction artistique</w:t>
       </w:r>
     </w:p>
     <w:p>
@@ -1913,45 +1854,39 @@
         <w:rPr>
           <w:rFonts w:asciiTheme="minorHAnsi" w:hAnsiTheme="minorHAnsi"/>
         </w:rPr>
-        <w:t>U</w:t>
-      </w:r>
-      <w:r>
-        <w:rPr>
-          <w:rFonts w:asciiTheme="minorHAnsi" w:hAnsiTheme="minorHAnsi"/>
-        </w:rPr>
-        <w:t>ne bande son</w:t>
+        <w:t>Une bande son</w:t>
       </w:r>
     </w:p>
     <w:p>
       <w:pPr>
         <w:pStyle w:val="Titre1"/>
       </w:pPr>
-      <w:bookmarkStart w:id="8" w:name="_Toc223020867"/>
+      <w:bookmarkStart w:id="7" w:name="_Toc223020867"/>
       <w:r>
         <w:t>D</w:t>
       </w:r>
       <w:r>
         <w:t>urée du projet</w:t>
       </w:r>
+      <w:bookmarkEnd w:id="7"/>
+    </w:p>
+    <w:p>
+      <w:r>
+        <w:t>Je dois mettre un travail équivalent à 13 h de travail par semaine le long du semestre, et 45 h lorsque mon semestre sera fini, donc en juillet. Cela fera un total de 450 h de travail disponibles.</w:t>
+      </w:r>
+    </w:p>
+    <w:p>
+      <w:pPr>
+        <w:pStyle w:val="Titre1"/>
+      </w:pPr>
+      <w:bookmarkStart w:id="8" w:name="_Toc223020868"/>
+      <w:r>
+        <w:t>D</w:t>
+      </w:r>
+      <w:r>
+        <w:t>élivrables</w:t>
+      </w:r>
       <w:bookmarkEnd w:id="8"/>
-    </w:p>
-    <w:p>
-      <w:r>
-        <w:t>Je dois mettre un travail équivalent à 13 h de travail par semaine le long du semestre, et 45 h lorsque mon semestre sera fini, donc en juillet. Cela fera un total de 450 h de travail disponibles.</w:t>
-      </w:r>
-    </w:p>
-    <w:p>
-      <w:pPr>
-        <w:pStyle w:val="Titre1"/>
-      </w:pPr>
-      <w:bookmarkStart w:id="9" w:name="_Toc223020868"/>
-      <w:r>
-        <w:t>D</w:t>
-      </w:r>
-      <w:r>
-        <w:t>élivrables</w:t>
-      </w:r>
-      <w:bookmarkEnd w:id="9"/>
     </w:p>
     <w:p>
       <w:pPr>
@@ -2040,14 +1975,14 @@
       <w:r>
         <w:t xml:space="preserve"> </w:t>
       </w:r>
-      <w:bookmarkStart w:id="10" w:name="_Toc223020869"/>
+      <w:bookmarkStart w:id="9" w:name="_Toc223020869"/>
       <w:r>
         <w:t>J</w:t>
       </w:r>
       <w:r>
         <w:t>alons</w:t>
       </w:r>
-      <w:bookmarkEnd w:id="10"/>
+      <w:bookmarkEnd w:id="9"/>
     </w:p>
     <w:p/>
     <w:p>
@@ -2069,31 +2004,10 @@
         <w:ind w:left="360"/>
       </w:pPr>
       <w:r>
-        <w:t>Milestone 2 : analyse et conception de schéma</w:t>
-      </w:r>
-      <w:r>
-        <w:t>s</w:t>
-      </w:r>
-      <w:r>
-        <w:t xml:space="preserve"> UML ainsi que pour la base de donnée</w:t>
-      </w:r>
-      <w:r>
-        <w:t>s.</w:t>
-      </w:r>
-      <w:r>
-        <w:t xml:space="preserve"> Il faudrait aussi avoir une idée </w:t>
-      </w:r>
-      <w:r>
-        <w:t>arrêt</w:t>
-      </w:r>
-      <w:r>
-        <w:t>ée</w:t>
-      </w:r>
-      <w:r>
-        <w:t xml:space="preserve"> sur l'architecture logiciel</w:t>
-      </w:r>
-      <w:r>
-        <w:t>le</w:t>
+        <w:t xml:space="preserve">Milestone 2 : analyse </w:t>
+      </w:r>
+      <w:r>
+        <w:t>des besoins ainsi que la spécification de ces derniers</w:t>
       </w:r>
     </w:p>
     <w:p>
@@ -2101,43 +2015,66 @@
         <w:ind w:left="360"/>
       </w:pPr>
       <w:r>
-        <w:t xml:space="preserve">Milestone 3 : setup du projet, et implémentation des 3 </w:t>
+        <w:t xml:space="preserve">Milestone 3 : </w:t>
+      </w:r>
+      <w:r>
+        <w:t xml:space="preserve">conception, réalisation de l’architecture </w:t>
       </w:r>
       <w:proofErr w:type="gramStart"/>
       <w:r>
-        <w:t>premier</w:t>
-      </w:r>
-      <w:r>
-        <w:t>s</w:t>
-      </w:r>
-      <w:r>
-        <w:t xml:space="preserve"> must</w:t>
+        <w:t>design(</w:t>
       </w:r>
       <w:proofErr w:type="gramEnd"/>
       <w:r>
-        <w:t xml:space="preserve"> have</w:t>
+        <w:t xml:space="preserve">stack, et UML de classe), design de </w:t>
+      </w:r>
+      <w:proofErr w:type="spellStart"/>
+      <w:r>
+        <w:t>database</w:t>
+      </w:r>
+      <w:proofErr w:type="spellEnd"/>
+      <w:r>
+        <w:t xml:space="preserve"> ainsi que le design de l’UI</w:t>
       </w:r>
     </w:p>
     <w:p>
       <w:pPr>
         <w:ind w:left="360"/>
-      </w:pPr>
-      <w:r>
-        <w:t xml:space="preserve">Milestone 4 : fin d'implémentation </w:t>
+        <w:rPr>
+          <w:lang w:val="en-GB"/>
+        </w:rPr>
+      </w:pPr>
+      <w:r>
+        <w:rPr>
+          <w:lang w:val="en-GB"/>
+        </w:rPr>
+        <w:t xml:space="preserve">Milestone </w:t>
       </w:r>
       <w:proofErr w:type="gramStart"/>
       <w:r>
-        <w:t>des must</w:t>
+        <w:rPr>
+          <w:lang w:val="en-GB"/>
+        </w:rPr>
+        <w:t>4 :</w:t>
       </w:r>
       <w:proofErr w:type="gramEnd"/>
       <w:r>
-        <w:t xml:space="preserve"> have, le jeu est jouable mais il n'y a qu'une seul</w:t>
-      </w:r>
-      <w:r>
-        <w:t>e</w:t>
-      </w:r>
-      <w:r>
-        <w:t xml:space="preserve"> unité jouable</w:t>
+        <w:rPr>
+          <w:lang w:val="en-GB"/>
+        </w:rPr>
+        <w:t xml:space="preserve"> </w:t>
+      </w:r>
+      <w:r>
+        <w:rPr>
+          <w:lang w:val="en-GB"/>
+        </w:rPr>
+        <w:t>implementation</w:t>
+      </w:r>
+      <w:r>
+        <w:rPr>
+          <w:lang w:val="en-GB"/>
+        </w:rPr>
+        <w:t xml:space="preserve"> des must have,</w:t>
       </w:r>
     </w:p>
     <w:p>
@@ -2145,68 +2082,41 @@
         <w:ind w:left="360"/>
       </w:pPr>
       <w:r>
-        <w:t>Milestone 5 : implémentation des différents tests devrait être fait</w:t>
-      </w:r>
-      <w:r>
-        <w:t>e</w:t>
+        <w:t xml:space="preserve">Milestone </w:t>
+      </w:r>
+      <w:r>
+        <w:t>5</w:t>
+      </w:r>
+      <w:r>
+        <w:t xml:space="preserve"> : impl</w:t>
+      </w:r>
+      <w:r>
+        <w:t>é</w:t>
+      </w:r>
+      <w:r>
+        <w:t xml:space="preserve">mentation des </w:t>
+      </w:r>
+      <w:proofErr w:type="spellStart"/>
+      <w:r>
+        <w:t>should</w:t>
+      </w:r>
+      <w:proofErr w:type="spellEnd"/>
+      <w:r>
+        <w:t xml:space="preserve"> have </w:t>
       </w:r>
     </w:p>
     <w:p>
       <w:pPr>
         <w:ind w:left="360"/>
-        <w:rPr>
-          <w:lang w:val="en-GB"/>
-        </w:rPr>
-      </w:pPr>
-      <w:r>
-        <w:rPr>
-          <w:lang w:val="en-GB"/>
-        </w:rPr>
+      </w:pPr>
+      <w:r>
         <w:t xml:space="preserve">Milestone </w:t>
       </w:r>
-      <w:proofErr w:type="gramStart"/>
-      <w:r>
-        <w:rPr>
-          <w:lang w:val="en-GB"/>
-        </w:rPr>
-        <w:t>6 :</w:t>
-      </w:r>
-      <w:proofErr w:type="gramEnd"/>
-      <w:r>
-        <w:rPr>
-          <w:lang w:val="en-GB"/>
-        </w:rPr>
-        <w:t xml:space="preserve"> </w:t>
-      </w:r>
-      <w:proofErr w:type="spellStart"/>
-      <w:r>
-        <w:rPr>
-          <w:lang w:val="en-GB"/>
-        </w:rPr>
-        <w:t>implémentation</w:t>
-      </w:r>
-      <w:proofErr w:type="spellEnd"/>
-      <w:r>
-        <w:rPr>
-          <w:lang w:val="en-GB"/>
-        </w:rPr>
-        <w:t xml:space="preserve"> des should have </w:t>
-      </w:r>
-      <w:proofErr w:type="spellStart"/>
-      <w:r>
-        <w:rPr>
-          <w:lang w:val="en-GB"/>
-        </w:rPr>
-        <w:t>finis</w:t>
-      </w:r>
-      <w:proofErr w:type="spellEnd"/>
-    </w:p>
-    <w:p>
-      <w:pPr>
-        <w:ind w:left="360"/>
-      </w:pPr>
-      <w:r>
-        <w:t xml:space="preserve">Milestone 7 : réalisation des documents </w:t>
+      <w:r>
+        <w:t>6</w:t>
+      </w:r>
+      <w:r>
+        <w:t xml:space="preserve"> : réalisation des documents </w:t>
       </w:r>
       <w:r>
         <w:t>à</w:t>
@@ -2266,6 +2176,7 @@
         <w:docPartUnique/>
       </w:docPartObj>
     </w:sdtPr>
+    <w:sdtEndPr/>
     <w:sdtContent>
       <w:p>
         <w:pPr>
@@ -2563,6 +2474,119 @@
     </w:lvl>
   </w:abstractNum>
   <w:abstractNum w:abstractNumId="2" w15:restartNumberingAfterBreak="0">
+    <w:nsid w:val="300C6931"/>
+    <w:multiLevelType w:val="hybridMultilevel"/>
+    <w:tmpl w:val="08946A80"/>
+    <w:lvl w:ilvl="0" w:tplc="100C000F">
+      <w:start w:val="1"/>
+      <w:numFmt w:val="decimal"/>
+      <w:lvlText w:val="%1."/>
+      <w:lvlJc w:val="left"/>
+      <w:pPr>
+        <w:ind w:left="720" w:hanging="360"/>
+      </w:pPr>
+      <w:rPr>
+        <w:rFonts w:hint="default"/>
+      </w:rPr>
+    </w:lvl>
+    <w:lvl w:ilvl="1" w:tplc="FFFFFFFF" w:tentative="1">
+      <w:start w:val="1"/>
+      <w:numFmt w:val="bullet"/>
+      <w:lvlText w:val="o"/>
+      <w:lvlJc w:val="left"/>
+      <w:pPr>
+        <w:ind w:left="1440" w:hanging="360"/>
+      </w:pPr>
+      <w:rPr>
+        <w:rFonts w:ascii="Courier New" w:hAnsi="Courier New" w:cs="Courier New" w:hint="default"/>
+      </w:rPr>
+    </w:lvl>
+    <w:lvl w:ilvl="2" w:tplc="FFFFFFFF" w:tentative="1">
+      <w:start w:val="1"/>
+      <w:numFmt w:val="bullet"/>
+      <w:lvlText w:val=""/>
+      <w:lvlJc w:val="left"/>
+      <w:pPr>
+        <w:ind w:left="2160" w:hanging="360"/>
+      </w:pPr>
+      <w:rPr>
+        <w:rFonts w:ascii="Wingdings" w:hAnsi="Wingdings" w:hint="default"/>
+      </w:rPr>
+    </w:lvl>
+    <w:lvl w:ilvl="3" w:tplc="FFFFFFFF" w:tentative="1">
+      <w:start w:val="1"/>
+      <w:numFmt w:val="bullet"/>
+      <w:lvlText w:val=""/>
+      <w:lvlJc w:val="left"/>
+      <w:pPr>
+        <w:ind w:left="2880" w:hanging="360"/>
+      </w:pPr>
+      <w:rPr>
+        <w:rFonts w:ascii="Symbol" w:hAnsi="Symbol" w:hint="default"/>
+      </w:rPr>
+    </w:lvl>
+    <w:lvl w:ilvl="4" w:tplc="FFFFFFFF" w:tentative="1">
+      <w:start w:val="1"/>
+      <w:numFmt w:val="bullet"/>
+      <w:lvlText w:val="o"/>
+      <w:lvlJc w:val="left"/>
+      <w:pPr>
+        <w:ind w:left="3600" w:hanging="360"/>
+      </w:pPr>
+      <w:rPr>
+        <w:rFonts w:ascii="Courier New" w:hAnsi="Courier New" w:cs="Courier New" w:hint="default"/>
+      </w:rPr>
+    </w:lvl>
+    <w:lvl w:ilvl="5" w:tplc="FFFFFFFF" w:tentative="1">
+      <w:start w:val="1"/>
+      <w:numFmt w:val="bullet"/>
+      <w:lvlText w:val=""/>
+      <w:lvlJc w:val="left"/>
+      <w:pPr>
+        <w:ind w:left="4320" w:hanging="360"/>
+      </w:pPr>
+      <w:rPr>
+        <w:rFonts w:ascii="Wingdings" w:hAnsi="Wingdings" w:hint="default"/>
+      </w:rPr>
+    </w:lvl>
+    <w:lvl w:ilvl="6" w:tplc="FFFFFFFF" w:tentative="1">
+      <w:start w:val="1"/>
+      <w:numFmt w:val="bullet"/>
+      <w:lvlText w:val=""/>
+      <w:lvlJc w:val="left"/>
+      <w:pPr>
+        <w:ind w:left="5040" w:hanging="360"/>
+      </w:pPr>
+      <w:rPr>
+        <w:rFonts w:ascii="Symbol" w:hAnsi="Symbol" w:hint="default"/>
+      </w:rPr>
+    </w:lvl>
+    <w:lvl w:ilvl="7" w:tplc="FFFFFFFF" w:tentative="1">
+      <w:start w:val="1"/>
+      <w:numFmt w:val="bullet"/>
+      <w:lvlText w:val="o"/>
+      <w:lvlJc w:val="left"/>
+      <w:pPr>
+        <w:ind w:left="5760" w:hanging="360"/>
+      </w:pPr>
+      <w:rPr>
+        <w:rFonts w:ascii="Courier New" w:hAnsi="Courier New" w:cs="Courier New" w:hint="default"/>
+      </w:rPr>
+    </w:lvl>
+    <w:lvl w:ilvl="8" w:tplc="FFFFFFFF" w:tentative="1">
+      <w:start w:val="1"/>
+      <w:numFmt w:val="bullet"/>
+      <w:lvlText w:val=""/>
+      <w:lvlJc w:val="left"/>
+      <w:pPr>
+        <w:ind w:left="6480" w:hanging="360"/>
+      </w:pPr>
+      <w:rPr>
+        <w:rFonts w:ascii="Wingdings" w:hAnsi="Wingdings" w:hint="default"/>
+      </w:rPr>
+    </w:lvl>
+  </w:abstractNum>
+  <w:abstractNum w:abstractNumId="3" w15:restartNumberingAfterBreak="0">
     <w:nsid w:val="360349FA"/>
     <w:multiLevelType w:val="hybridMultilevel"/>
     <w:tmpl w:val="9E1C45C8"/>
@@ -2675,7 +2699,7 @@
       </w:rPr>
     </w:lvl>
   </w:abstractNum>
-  <w:abstractNum w:abstractNumId="3" w15:restartNumberingAfterBreak="0">
+  <w:abstractNum w:abstractNumId="4" w15:restartNumberingAfterBreak="0">
     <w:nsid w:val="40BC32DF"/>
     <w:multiLevelType w:val="hybridMultilevel"/>
     <w:tmpl w:val="7D98A148"/>
@@ -2787,10 +2811,10 @@
       </w:rPr>
     </w:lvl>
   </w:abstractNum>
-  <w:abstractNum w:abstractNumId="4" w15:restartNumberingAfterBreak="0">
+  <w:abstractNum w:abstractNumId="5" w15:restartNumberingAfterBreak="0">
     <w:nsid w:val="42724504"/>
     <w:multiLevelType w:val="hybridMultilevel"/>
-    <w:tmpl w:val="4698847C"/>
+    <w:tmpl w:val="C68EB712"/>
     <w:lvl w:ilvl="0" w:tplc="EDC4FF9E">
       <w:numFmt w:val="bullet"/>
       <w:lvlText w:val="-"/>
@@ -2802,7 +2826,7 @@
         <w:rFonts w:ascii="Aptos" w:eastAsiaTheme="minorHAnsi" w:hAnsi="Aptos" w:cstheme="minorBidi" w:hint="default"/>
       </w:rPr>
     </w:lvl>
-    <w:lvl w:ilvl="1" w:tplc="100C0003" w:tentative="1">
+    <w:lvl w:ilvl="1" w:tplc="100C0003">
       <w:start w:val="1"/>
       <w:numFmt w:val="bullet"/>
       <w:lvlText w:val="o"/>
@@ -2899,7 +2923,7 @@
       </w:rPr>
     </w:lvl>
   </w:abstractNum>
-  <w:abstractNum w:abstractNumId="5" w15:restartNumberingAfterBreak="0">
+  <w:abstractNum w:abstractNumId="6" w15:restartNumberingAfterBreak="0">
     <w:nsid w:val="43566FB1"/>
     <w:multiLevelType w:val="hybridMultilevel"/>
     <w:tmpl w:val="73BE9950"/>
@@ -3011,7 +3035,93 @@
       </w:rPr>
     </w:lvl>
   </w:abstractNum>
-  <w:abstractNum w:abstractNumId="6" w15:restartNumberingAfterBreak="0">
+  <w:abstractNum w:abstractNumId="7" w15:restartNumberingAfterBreak="0">
+    <w:nsid w:val="4CBB6436"/>
+    <w:multiLevelType w:val="hybridMultilevel"/>
+    <w:tmpl w:val="82DE034E"/>
+    <w:lvl w:ilvl="0" w:tplc="100C000F">
+      <w:start w:val="1"/>
+      <w:numFmt w:val="decimal"/>
+      <w:lvlText w:val="%1."/>
+      <w:lvlJc w:val="left"/>
+      <w:pPr>
+        <w:ind w:left="1080" w:hanging="360"/>
+      </w:pPr>
+    </w:lvl>
+    <w:lvl w:ilvl="1" w:tplc="100C0019" w:tentative="1">
+      <w:start w:val="1"/>
+      <w:numFmt w:val="lowerLetter"/>
+      <w:lvlText w:val="%2."/>
+      <w:lvlJc w:val="left"/>
+      <w:pPr>
+        <w:ind w:left="1800" w:hanging="360"/>
+      </w:pPr>
+    </w:lvl>
+    <w:lvl w:ilvl="2" w:tplc="100C001B" w:tentative="1">
+      <w:start w:val="1"/>
+      <w:numFmt w:val="lowerRoman"/>
+      <w:lvlText w:val="%3."/>
+      <w:lvlJc w:val="right"/>
+      <w:pPr>
+        <w:ind w:left="2520" w:hanging="180"/>
+      </w:pPr>
+    </w:lvl>
+    <w:lvl w:ilvl="3" w:tplc="100C000F" w:tentative="1">
+      <w:start w:val="1"/>
+      <w:numFmt w:val="decimal"/>
+      <w:lvlText w:val="%4."/>
+      <w:lvlJc w:val="left"/>
+      <w:pPr>
+        <w:ind w:left="3240" w:hanging="360"/>
+      </w:pPr>
+    </w:lvl>
+    <w:lvl w:ilvl="4" w:tplc="100C0019" w:tentative="1">
+      <w:start w:val="1"/>
+      <w:numFmt w:val="lowerLetter"/>
+      <w:lvlText w:val="%5."/>
+      <w:lvlJc w:val="left"/>
+      <w:pPr>
+        <w:ind w:left="3960" w:hanging="360"/>
+      </w:pPr>
+    </w:lvl>
+    <w:lvl w:ilvl="5" w:tplc="100C001B" w:tentative="1">
+      <w:start w:val="1"/>
+      <w:numFmt w:val="lowerRoman"/>
+      <w:lvlText w:val="%6."/>
+      <w:lvlJc w:val="right"/>
+      <w:pPr>
+        <w:ind w:left="4680" w:hanging="180"/>
+      </w:pPr>
+    </w:lvl>
+    <w:lvl w:ilvl="6" w:tplc="100C000F" w:tentative="1">
+      <w:start w:val="1"/>
+      <w:numFmt w:val="decimal"/>
+      <w:lvlText w:val="%7."/>
+      <w:lvlJc w:val="left"/>
+      <w:pPr>
+        <w:ind w:left="5400" w:hanging="360"/>
+      </w:pPr>
+    </w:lvl>
+    <w:lvl w:ilvl="7" w:tplc="100C0019" w:tentative="1">
+      <w:start w:val="1"/>
+      <w:numFmt w:val="lowerLetter"/>
+      <w:lvlText w:val="%8."/>
+      <w:lvlJc w:val="left"/>
+      <w:pPr>
+        <w:ind w:left="6120" w:hanging="360"/>
+      </w:pPr>
+    </w:lvl>
+    <w:lvl w:ilvl="8" w:tplc="100C001B" w:tentative="1">
+      <w:start w:val="1"/>
+      <w:numFmt w:val="lowerRoman"/>
+      <w:lvlText w:val="%9."/>
+      <w:lvlJc w:val="right"/>
+      <w:pPr>
+        <w:ind w:left="6840" w:hanging="180"/>
+      </w:pPr>
+    </w:lvl>
+  </w:abstractNum>
+  <w:abstractNum w:abstractNumId="8" w15:restartNumberingAfterBreak="0">
     <w:nsid w:val="575D48C4"/>
     <w:multiLevelType w:val="hybridMultilevel"/>
     <w:tmpl w:val="BC62837C"/>
@@ -3123,7 +3233,7 @@
       </w:rPr>
     </w:lvl>
   </w:abstractNum>
-  <w:abstractNum w:abstractNumId="7" w15:restartNumberingAfterBreak="0">
+  <w:abstractNum w:abstractNumId="9" w15:restartNumberingAfterBreak="0">
     <w:nsid w:val="5F1B5B5D"/>
     <w:multiLevelType w:val="hybridMultilevel"/>
     <w:tmpl w:val="A9AA5B6E"/>
@@ -3235,7 +3345,7 @@
       </w:rPr>
     </w:lvl>
   </w:abstractNum>
-  <w:abstractNum w:abstractNumId="8" w15:restartNumberingAfterBreak="0">
+  <w:abstractNum w:abstractNumId="10" w15:restartNumberingAfterBreak="0">
     <w:nsid w:val="62A52A2E"/>
     <w:multiLevelType w:val="hybridMultilevel"/>
     <w:tmpl w:val="DE0ADBE2"/>
@@ -3347,7 +3457,7 @@
       </w:rPr>
     </w:lvl>
   </w:abstractNum>
-  <w:abstractNum w:abstractNumId="9" w15:restartNumberingAfterBreak="0">
+  <w:abstractNum w:abstractNumId="11" w15:restartNumberingAfterBreak="0">
     <w:nsid w:val="674640A2"/>
     <w:multiLevelType w:val="hybridMultilevel"/>
     <w:tmpl w:val="A64089F0"/>
@@ -3459,7 +3569,93 @@
       </w:rPr>
     </w:lvl>
   </w:abstractNum>
-  <w:abstractNum w:abstractNumId="10" w15:restartNumberingAfterBreak="0">
+  <w:abstractNum w:abstractNumId="12" w15:restartNumberingAfterBreak="0">
+    <w:nsid w:val="797419DD"/>
+    <w:multiLevelType w:val="hybridMultilevel"/>
+    <w:tmpl w:val="C9904D98"/>
+    <w:lvl w:ilvl="0" w:tplc="100C000F">
+      <w:start w:val="1"/>
+      <w:numFmt w:val="decimal"/>
+      <w:lvlText w:val="%1."/>
+      <w:lvlJc w:val="left"/>
+      <w:pPr>
+        <w:ind w:left="1080" w:hanging="360"/>
+      </w:pPr>
+    </w:lvl>
+    <w:lvl w:ilvl="1" w:tplc="100C0019" w:tentative="1">
+      <w:start w:val="1"/>
+      <w:numFmt w:val="lowerLetter"/>
+      <w:lvlText w:val="%2."/>
+      <w:lvlJc w:val="left"/>
+      <w:pPr>
+        <w:ind w:left="1800" w:hanging="360"/>
+      </w:pPr>
+    </w:lvl>
+    <w:lvl w:ilvl="2" w:tplc="100C001B" w:tentative="1">
+      <w:start w:val="1"/>
+      <w:numFmt w:val="lowerRoman"/>
+      <w:lvlText w:val="%3."/>
+      <w:lvlJc w:val="right"/>
+      <w:pPr>
+        <w:ind w:left="2520" w:hanging="180"/>
+      </w:pPr>
+    </w:lvl>
+    <w:lvl w:ilvl="3" w:tplc="100C000F" w:tentative="1">
+      <w:start w:val="1"/>
+      <w:numFmt w:val="decimal"/>
+      <w:lvlText w:val="%4."/>
+      <w:lvlJc w:val="left"/>
+      <w:pPr>
+        <w:ind w:left="3240" w:hanging="360"/>
+      </w:pPr>
+    </w:lvl>
+    <w:lvl w:ilvl="4" w:tplc="100C0019" w:tentative="1">
+      <w:start w:val="1"/>
+      <w:numFmt w:val="lowerLetter"/>
+      <w:lvlText w:val="%5."/>
+      <w:lvlJc w:val="left"/>
+      <w:pPr>
+        <w:ind w:left="3960" w:hanging="360"/>
+      </w:pPr>
+    </w:lvl>
+    <w:lvl w:ilvl="5" w:tplc="100C001B" w:tentative="1">
+      <w:start w:val="1"/>
+      <w:numFmt w:val="lowerRoman"/>
+      <w:lvlText w:val="%6."/>
+      <w:lvlJc w:val="right"/>
+      <w:pPr>
+        <w:ind w:left="4680" w:hanging="180"/>
+      </w:pPr>
+    </w:lvl>
+    <w:lvl w:ilvl="6" w:tplc="100C000F" w:tentative="1">
+      <w:start w:val="1"/>
+      <w:numFmt w:val="decimal"/>
+      <w:lvlText w:val="%7."/>
+      <w:lvlJc w:val="left"/>
+      <w:pPr>
+        <w:ind w:left="5400" w:hanging="360"/>
+      </w:pPr>
+    </w:lvl>
+    <w:lvl w:ilvl="7" w:tplc="100C0019" w:tentative="1">
+      <w:start w:val="1"/>
+      <w:numFmt w:val="lowerLetter"/>
+      <w:lvlText w:val="%8."/>
+      <w:lvlJc w:val="left"/>
+      <w:pPr>
+        <w:ind w:left="6120" w:hanging="360"/>
+      </w:pPr>
+    </w:lvl>
+    <w:lvl w:ilvl="8" w:tplc="100C001B" w:tentative="1">
+      <w:start w:val="1"/>
+      <w:numFmt w:val="lowerRoman"/>
+      <w:lvlText w:val="%9."/>
+      <w:lvlJc w:val="right"/>
+      <w:pPr>
+        <w:ind w:left="6840" w:hanging="180"/>
+      </w:pPr>
+    </w:lvl>
+  </w:abstractNum>
+  <w:abstractNum w:abstractNumId="13" w15:restartNumberingAfterBreak="0">
     <w:nsid w:val="79B90CC3"/>
     <w:multiLevelType w:val="hybridMultilevel"/>
     <w:tmpl w:val="F3301776"/>
@@ -3572,37 +3768,46 @@
     </w:lvl>
   </w:abstractNum>
   <w:num w:numId="1" w16cid:durableId="1892956481">
-    <w:abstractNumId w:val="2"/>
+    <w:abstractNumId w:val="3"/>
   </w:num>
   <w:num w:numId="2" w16cid:durableId="1283340367">
     <w:abstractNumId w:val="0"/>
   </w:num>
   <w:num w:numId="3" w16cid:durableId="622417853">
-    <w:abstractNumId w:val="5"/>
+    <w:abstractNumId w:val="6"/>
   </w:num>
   <w:num w:numId="4" w16cid:durableId="772555951">
-    <w:abstractNumId w:val="3"/>
+    <w:abstractNumId w:val="4"/>
   </w:num>
   <w:num w:numId="5" w16cid:durableId="292518605">
-    <w:abstractNumId w:val="9"/>
+    <w:abstractNumId w:val="11"/>
   </w:num>
   <w:num w:numId="6" w16cid:durableId="1598322939">
-    <w:abstractNumId w:val="10"/>
+    <w:abstractNumId w:val="13"/>
   </w:num>
   <w:num w:numId="7" w16cid:durableId="11691283">
-    <w:abstractNumId w:val="7"/>
+    <w:abstractNumId w:val="9"/>
   </w:num>
   <w:num w:numId="8" w16cid:durableId="1492793023">
     <w:abstractNumId w:val="1"/>
   </w:num>
   <w:num w:numId="9" w16cid:durableId="647904979">
-    <w:abstractNumId w:val="6"/>
+    <w:abstractNumId w:val="8"/>
   </w:num>
   <w:num w:numId="10" w16cid:durableId="2002271203">
-    <w:abstractNumId w:val="4"/>
+    <w:abstractNumId w:val="5"/>
   </w:num>
   <w:num w:numId="11" w16cid:durableId="855653982">
-    <w:abstractNumId w:val="8"/>
+    <w:abstractNumId w:val="10"/>
+  </w:num>
+  <w:num w:numId="12" w16cid:durableId="950935396">
+    <w:abstractNumId w:val="2"/>
+  </w:num>
+  <w:num w:numId="13" w16cid:durableId="214397424">
+    <w:abstractNumId w:val="7"/>
+  </w:num>
+  <w:num w:numId="14" w16cid:durableId="1542791673">
+    <w:abstractNumId w:val="12"/>
   </w:num>
 </w:numbering>
 </file>
@@ -4209,6 +4414,7 @@
   <w:style w:type="character" w:default="1" w:styleId="Policepardfaut">
     <w:name w:val="Default Paragraph Font"/>
     <w:uiPriority w:val="1"/>
+    <w:semiHidden/>
     <w:unhideWhenUsed/>
   </w:style>
   <w:style w:type="table" w:default="1" w:styleId="TableauNormal">

</xml_diff>